<commit_message>
Trying random stuff in the hopes that ARM64 will compile. Also Sensything which is really only partial
</commit_message>
<xml_diff>
--- a/Adding-BT-devices-V4-CozyTime_CT01.docx
+++ b/Adding-BT-devices-V4-CozyTime_CT01.docx
@@ -7,12 +7,27 @@
         <w:pStyle w:val="Heading1"/>
       </w:pPr>
       <w:r>
-        <w:t>How to add BT devices to the Bluetooth Device Explorer</w:t>
-      </w:r>
-    </w:p>
-    <w:p>
-      <w:r>
-        <w:t>The Bluetooth Device Explorer can be customized to allow a user to find, view, and control specialized Bluetooth devices. A specialized device is one where the device is known to the Bluetooth Device Explorer app and which</w:t>
+        <w:t xml:space="preserve">How to add BT devices to the Bluetooth Device </w:t>
+      </w:r>
+      <w:r>
+        <w:t>Controller</w:t>
+      </w:r>
+    </w:p>
+    <w:p>
+      <w:r>
+        <w:t xml:space="preserve">The Bluetooth Device </w:t>
+      </w:r>
+      <w:r>
+        <w:t>Controller</w:t>
+      </w:r>
+      <w:r>
+        <w:t xml:space="preserve"> can be customized to allow a user to find, view, and control specialized Bluetooth devices. A specialized device is one where the device is known to the Bluetooth Device </w:t>
+      </w:r>
+      <w:r>
+        <w:t>Controller</w:t>
+      </w:r>
+      <w:r>
+        <w:t xml:space="preserve"> app and which</w:t>
       </w:r>
       <w:r>
         <w:t>, when viewed, will show a potentially customized display.</w:t>
@@ -20,7 +35,13 @@
     </w:p>
     <w:p>
       <w:r>
-        <w:t>This guide will show you how to add specializations of devices to the Bluetooth Device Explorer.</w:t>
+        <w:t xml:space="preserve">This guide will show you how to add specializations of devices to the Bluetooth Device </w:t>
+      </w:r>
+      <w:r>
+        <w:t>Controller</w:t>
+      </w:r>
+      <w:r>
+        <w:t>.</w:t>
       </w:r>
       <w:r>
         <w:t xml:space="preserve"> </w:t>
@@ -147,7 +168,13 @@
     <w:p/>
     <w:p>
       <w:r>
-        <w:t>We will use an automatically JSON description of the device as a starting point and will add additional information so that we can generate a useable Bluetooth protocol C# file and XAML UI file.</w:t>
+        <w:t xml:space="preserve">We will use an automatically </w:t>
+      </w:r>
+      <w:r>
+        <w:t xml:space="preserve">generated </w:t>
+      </w:r>
+      <w:r>
+        <w:t>JSON description of the device as a starting point and will add additional information so that we can generate a useable Bluetooth protocol C# file and XAML UI file.</w:t>
       </w:r>
     </w:p>
     <w:p>
@@ -164,6 +191,7 @@
         </w:numPr>
       </w:pPr>
       <w:r>
+        <w:lastRenderedPageBreak/>
         <w:t>You need to see the device on the screen with a list of its attributes</w:t>
       </w:r>
     </w:p>
@@ -221,6 +249,9 @@
         <w:br/>
       </w:r>
       <w:r>
+        <w:rPr>
+          <w:noProof/>
+        </w:rPr>
         <w:drawing>
           <wp:inline distT="0" distB="0" distL="0" distR="0" wp14:anchorId="75C6BC9A" wp14:editId="2DA7AC42">
             <wp:extent cx="2870200" cy="2997151"/>
@@ -344,6 +375,7 @@
         <w:rPr>
           <w:noProof/>
         </w:rPr>
+        <w:lastRenderedPageBreak/>
         <w:drawing>
           <wp:inline distT="0" distB="0" distL="0" distR="0" wp14:anchorId="78F1858B" wp14:editId="22B1C123">
             <wp:extent cx="5486067" cy="3434330"/>
@@ -577,6 +609,7 @@
           <w:b/>
           <w:bCs/>
         </w:rPr>
+        <w:lastRenderedPageBreak/>
         <w:t>Aliases</w:t>
       </w:r>
       <w:r>
@@ -828,7 +861,16 @@
     </w:p>
     <w:p>
       <w:r>
-        <w:t>Rebuild and run the app and examine the same device. Be sure to run the app in Release mode (CTRL-F5); the next step will be modifying the project and you can’t do that in Debug mode. The snippet of JSON at the bottom of the screen should reflect your changes:</w:t>
+        <w:t xml:space="preserve">Rebuild and run the app and examine the same device. Be sure to run the app in Release mode (CTRL-F5); the next step will be modifying the project and you can’t do that in Debug mode. </w:t>
+      </w:r>
+      <w:r>
+        <w:rPr>
+          <w:strike/>
+        </w:rPr>
+        <w:t>The snippet of JSON at the bottom of the screen should reflect your changes:</w:t>
+      </w:r>
+      <w:r>
+        <w:t xml:space="preserve"> TODO: remove that sentence and the image; the JSON isn’t displayed any more</w:t>
       </w:r>
     </w:p>
     <w:p>
@@ -836,6 +878,7 @@
         <w:rPr>
           <w:noProof/>
         </w:rPr>
+        <w:lastRenderedPageBreak/>
         <w:drawing>
           <wp:inline distT="0" distB="0" distL="0" distR="0" wp14:anchorId="20CB2D22" wp14:editId="339C405E">
             <wp:extent cx="5943600" cy="3690620"/>
@@ -889,7 +932,14 @@
         <w:t xml:space="preserve"> This is done with the </w:t>
       </w:r>
       <w:r>
-        <w:t>BluetoothCodeGeneratordotNetCore program.</w:t>
+        <w:rPr>
+          <w:b/>
+          <w:bCs/>
+        </w:rPr>
+        <w:t>BluetoothCodeGeneratordotNetCore</w:t>
+      </w:r>
+      <w:r>
+        <w:t xml:space="preserve"> program.</w:t>
       </w:r>
     </w:p>
     <w:p>
@@ -1082,11 +1132,18 @@
         <w:t>List&lt;Specialization&gt; Specializations</w:t>
       </w:r>
       <w:r>
-        <w:t xml:space="preserve"> line. This is a list of all speciality devices that are known. Dice quality as a “fun” specialization, so I added it as a “fun” specialization. Keep the list in roughly alphabetical order.</w:t>
-      </w:r>
-    </w:p>
-    <w:p>
-      <w:r>
+        <w:t xml:space="preserve"> line. </w:t>
+      </w:r>
+      <w:r>
+        <w:t xml:space="preserve">There’s a handy comment that starts with /// ADD: to help find this. It </w:t>
+      </w:r>
+      <w:r>
+        <w:t>is a list of all speciality devices that are known. Dice quality as a “fun” specialization, so I added it as a “fun” specialization. Keep the list in roughly alphabetical order.</w:t>
+      </w:r>
+    </w:p>
+    <w:p>
+      <w:r>
+        <w:lastRenderedPageBreak/>
         <w:t>The specialization list includes</w:t>
       </w:r>
     </w:p>
@@ -1242,6 +1299,7 @@
         </w:numPr>
       </w:pPr>
       <w:r>
+        <w:lastRenderedPageBreak/>
         <w:t>Add examples to the transmit and receive characteristics to show the set of valid commands. These are just for programmers; they aren’t used by the program at all.</w:t>
       </w:r>
     </w:p>
@@ -1362,6 +1420,7 @@
         <w:rPr>
           <w:noProof/>
         </w:rPr>
+        <w:lastRenderedPageBreak/>
         <w:drawing>
           <wp:inline distT="0" distB="0" distL="0" distR="0" wp14:anchorId="35EE4A61" wp14:editId="379A0129">
             <wp:extent cx="5943600" cy="3684270"/>
@@ -2171,6 +2230,7 @@
   <w:style w:type="character" w:default="1" w:styleId="DefaultParagraphFont">
     <w:name w:val="Default Paragraph Font"/>
     <w:uiPriority w:val="1"/>
+    <w:semiHidden/>
     <w:unhideWhenUsed/>
   </w:style>
   <w:style w:type="table" w:default="1" w:styleId="TableNormal">

</xml_diff>